<commit_message>
Refactor lab reports and documentation for clarity and consistency; add Lab 2 README and edge case testing report
</commit_message>
<xml_diff>
--- a/lab1/docs/architecture.docx
+++ b/lab1/docs/architecture.docx
@@ -4,377 +4,488 @@
   <w:body>
     <w:p>
       <w:pPr>
-        <w:pStyle w:val="Title"/>
+        <w:jc w:val="center"/>
+        <w:spacing w:after="120"/>
       </w:pPr>
       <w:r>
-        <w:t>Architecture</w:t>
-      </w:r>
-    </w:p>
-    <w:p>
-      <w:r>
-        <w:t>Subject: System Architecture and Integration 2</w:t>
-        <w:br/>
-        <w:t>Section: BIST 3B</w:t>
-        <w:br/>
-        <w:t>Members: Sagum, Patrick Ruiz · Henson, Princess Terana Caram Rasonable · Gargarita, Trisha Faith Casiano · Mogat, Ela Mae Trojillo · Tibo-oc, Paul Felippe Gelle</w:t>
+        <w:rPr>
+          <w:rFonts w:ascii="Cambria" w:hAnsi="Cambria" w:cs="Cambria"/>
+          <w:b/>
+          <w:i w:val="0"/>
+          <w:sz w:val="22"/>
+        </w:rPr>
+        <w:t>Architecture Diagrams — Monolithic vs Microservices</w:t>
       </w:r>
     </w:p>
     <w:p>
       <w:pPr>
-        <w:pStyle w:val="Heading1"/>
+        <w:jc w:val="center"/>
+        <w:spacing w:after="240"/>
       </w:pPr>
       <w:r>
-        <w:t>Architecture Comparison</w:t>
+        <w:rPr>
+          <w:rFonts w:ascii="Cambria" w:hAnsi="Cambria" w:cs="Cambria"/>
+          <w:b w:val="0"/>
+          <w:i w:val="0"/>
+          <w:sz w:val="20"/>
+        </w:rPr>
+        <w:t>Sagum, Patrick R.; Henson, Princess Terana Caram Rasonable;</w:t>
+      </w:r>
+      <w:r>
+        <w:br/>
+      </w:r>
+      <w:r>
+        <w:rPr>
+          <w:rFonts w:ascii="Cambria" w:hAnsi="Cambria" w:cs="Cambria"/>
+          <w:b w:val="0"/>
+          <w:i w:val="0"/>
+          <w:sz w:val="20"/>
+        </w:rPr>
+        <w:t>Gargarita, Trisha Faith Casiano; Mogat, Ela Mae Trojillo;</w:t>
+      </w:r>
+      <w:r>
+        <w:br/>
+      </w:r>
+      <w:r>
+        <w:rPr>
+          <w:rFonts w:ascii="Cambria" w:hAnsi="Cambria" w:cs="Cambria"/>
+          <w:b w:val="0"/>
+          <w:i w:val="0"/>
+          <w:sz w:val="20"/>
+        </w:rPr>
+        <w:t>Tibo-oc, Paul Felippe Gelle</w:t>
+      </w:r>
+      <w:r>
+        <w:br/>
+      </w:r>
+      <w:r>
+        <w:rPr>
+          <w:rFonts w:ascii="Cambria" w:hAnsi="Cambria" w:cs="Cambria"/>
+          <w:b w:val="0"/>
+          <w:i/>
+          <w:sz w:val="20"/>
+        </w:rPr>
+        <w:t>Information Technology, College of Computer Studies</w:t>
+      </w:r>
+      <w:r>
+        <w:br/>
+      </w:r>
+      <w:r>
+        <w:rPr>
+          <w:rFonts w:ascii="Cambria" w:hAnsi="Cambria" w:cs="Cambria"/>
+          <w:b w:val="0"/>
+          <w:i/>
+          <w:sz w:val="20"/>
+        </w:rPr>
+        <w:t>Carlos Hilado Memorial State University</w:t>
+      </w:r>
+    </w:p>
+    <w:p>
+      <w:pPr>
+        <w:spacing w:before="240" w:after="120"/>
+      </w:pPr>
+      <w:r>
+        <w:rPr>
+          <w:rFonts w:ascii="Cambria" w:hAnsi="Cambria" w:cs="Cambria"/>
+          <w:b/>
+          <w:i w:val="0"/>
+          <w:sz w:val="22"/>
+        </w:rPr>
+        <w:t>Section 1 — Monolithic Architecture</w:t>
       </w:r>
     </w:p>
     <w:p>
       <w:r>
         <w:rPr>
+          <w:rFonts w:ascii="Cambria" w:hAnsi="Cambria" w:cs="Cambria"/>
           <w:b w:val="0"/>
+          <w:i w:val="0"/>
+          <w:sz w:val="20"/>
         </w:rPr>
-        <w:t>Academe is a student course management system built with Laravel 10 and PHP 8.4. It demonstrates two architectural approaches — a monolithic application using the Model–View–Controller–Repository (MVCR) pattern and a microservices decomposition into three independent services — with a runtime toggle that lets the frontend switch between them.</w:t>
+        <w:t>The monolithic application is a single Laravel project located in lab1/academe/. It uses one SQLite database file (database/database.sqlite) and follows the Model–View–Controller–Repository (MVCR) pattern. Every request flows through the route layer, into a FormRequest for validation, then to a Controller that injects a Repository Interface. The concrete Repository Implementation talks to Eloquent Models, which read from and write to the single SQLite database. The Controller returns data to Blade views for server-side rendering. All three domains — Students, Courses, and Enrollments — live in one codebase, share one database, and deploy as a single unit. The APP_BACKEND variable in .env controls whether the Controller routes through the local Repository (monolithic mode) or through HTTP Service Clients (microservices mode).</w:t>
       </w:r>
     </w:p>
+    <w:tbl>
+      <w:tblPr>
+        <w:tblW w:type="auto" w:w="0"/>
+        <w:jc w:val="center"/>
+        <w:tblLook w:firstColumn="1" w:firstRow="1" w:lastColumn="0" w:lastRow="0" w:noHBand="0" w:noVBand="1" w:val="04A0"/>
+      </w:tblPr>
+      <w:tblGrid>
+        <w:gridCol w:w="9360"/>
+      </w:tblGrid>
+      <w:tr>
+        <w:tc>
+          <w:tcPr>
+            <w:tcW w:type="dxa" w:w="9360"/>
+            <w:shd w:fill="F2F2F2"/>
+            <w:tcBorders>
+              <w:top w:val="single" w:sz="8" w:space="0" w:color="999999"/>
+              <w:left w:val="single" w:sz="8" w:space="0" w:color="999999"/>
+              <w:bottom w:val="single" w:sz="8" w:space="0" w:color="999999"/>
+              <w:right w:val="single" w:sz="8" w:space="0" w:color="999999"/>
+            </w:tcBorders>
+            <w:tcW w:w="9000" w:type="dxa"/>
+          </w:tcPr>
+          <w:p>
+            <w:r>
+              <w:rPr>
+                <w:rFonts w:ascii="Courier New" w:hAnsi="Courier New" w:cs="Courier New"/>
+                <w:b/>
+                <w:i w:val="0"/>
+                <w:sz w:val="18"/>
+              </w:rPr>
+              <w:t>[SCREENSHOT REQUIRED]</w:t>
+            </w:r>
+          </w:p>
+          <w:p>
+            <w:r>
+              <w:rPr>
+                <w:rFonts w:ascii="Courier New" w:hAnsi="Courier New" w:cs="Courier New"/>
+                <w:b w:val="0"/>
+                <w:i w:val="0"/>
+                <w:sz w:val="18"/>
+              </w:rPr>
+              <w:t>HOW: Set APP_BACKEND=monolithic in lab1/academe/.env</w:t>
+            </w:r>
+          </w:p>
+          <w:p>
+            <w:r>
+              <w:rPr>
+                <w:rFonts w:ascii="Courier New" w:hAnsi="Courier New" w:cs="Courier New"/>
+                <w:b w:val="0"/>
+                <w:i w:val="0"/>
+                <w:sz w:val="18"/>
+              </w:rPr>
+              <w:t>Run: php artisan config:clear</w:t>
+            </w:r>
+          </w:p>
+          <w:p>
+            <w:r>
+              <w:rPr>
+                <w:rFonts w:ascii="Courier New" w:hAnsi="Courier New" w:cs="Courier New"/>
+                <w:b w:val="0"/>
+                <w:i w:val="0"/>
+                <w:sz w:val="18"/>
+              </w:rPr>
+              <w:t>Visit: localhost:8000/architecture</w:t>
+            </w:r>
+          </w:p>
+          <w:p>
+            <w:r>
+              <w:rPr>
+                <w:rFonts w:ascii="Courier New" w:hAnsi="Courier New" w:cs="Courier New"/>
+                <w:b w:val="0"/>
+                <w:i w:val="0"/>
+                <w:sz w:val="18"/>
+              </w:rPr>
+              <w:t>Screenshot: monolithic diagram section</w:t>
+            </w:r>
+          </w:p>
+          <w:p>
+            <w:r>
+              <w:rPr>
+                <w:rFonts w:ascii="Cambria" w:hAnsi="Cambria" w:cs="Cambria"/>
+                <w:b w:val="0"/>
+                <w:i/>
+                <w:sz w:val="20"/>
+              </w:rPr>
+              <w:t>Caption: "Monolithic Architecture — Single Laravel app, single SQLite database, all features in one codebase"</w:t>
+            </w:r>
+          </w:p>
+        </w:tc>
+      </w:tr>
+    </w:tbl>
+    <w:p/>
     <w:p>
       <w:pPr>
-        <w:pStyle w:val="Heading2"/>
+        <w:spacing w:before="240" w:after="120"/>
       </w:pPr>
       <w:r>
-        <w:t>1. Monolithic Architecture (MVCR)</w:t>
+        <w:rPr>
+          <w:rFonts w:ascii="Cambria" w:hAnsi="Cambria" w:cs="Cambria"/>
+          <w:b/>
+          <w:i w:val="0"/>
+          <w:sz w:val="22"/>
+        </w:rPr>
+        <w:t>Section 2 — Microservices Architecture</w:t>
       </w:r>
     </w:p>
     <w:p>
       <w:r>
         <w:rPr>
+          <w:rFonts w:ascii="Cambria" w:hAnsi="Cambria" w:cs="Cambria"/>
           <w:b w:val="0"/>
+          <w:i w:val="0"/>
+          <w:sz w:val="20"/>
         </w:rPr>
-        <w:t>The monolithic application (academe/) follows the MVCR pattern inside a single Laravel project. Every request flows through seven layers:</w:t>
+        <w:t>The microservices decomposition splits the system into three independent Laravel applications: student-service (port 8001), course-service (port 8002), and enrollment-service (port 8003). Each service owns its own SQLite database file and exposes a JSON REST API. The enrollment-service validates foreign keys by making synchronous HTTP GET calls to the student-service and course-service before persisting any enrollment record. These calls use Http::timeout(5) and are wrapped in try/catch blocks to handle 503 (connection refused) and 504 (timeout) scenarios independently. Each service follows the same MVCR pattern internally — Controller → Repository Interface → Repository Implementation → Eloquent Model → SQLite. There is no shared database, no message queue, and no API gateway.</w:t>
       </w:r>
     </w:p>
+    <w:tbl>
+      <w:tblPr>
+        <w:tblW w:type="auto" w:w="0"/>
+        <w:jc w:val="center"/>
+        <w:tblLook w:firstColumn="1" w:firstRow="1" w:lastColumn="0" w:lastRow="0" w:noHBand="0" w:noVBand="1" w:val="04A0"/>
+      </w:tblPr>
+      <w:tblGrid>
+        <w:gridCol w:w="9360"/>
+      </w:tblGrid>
+      <w:tr>
+        <w:tc>
+          <w:tcPr>
+            <w:tcW w:type="dxa" w:w="9360"/>
+            <w:shd w:fill="F2F2F2"/>
+            <w:tcBorders>
+              <w:top w:val="single" w:sz="8" w:space="0" w:color="999999"/>
+              <w:left w:val="single" w:sz="8" w:space="0" w:color="999999"/>
+              <w:bottom w:val="single" w:sz="8" w:space="0" w:color="999999"/>
+              <w:right w:val="single" w:sz="8" w:space="0" w:color="999999"/>
+            </w:tcBorders>
+            <w:tcW w:w="9000" w:type="dxa"/>
+          </w:tcPr>
+          <w:p>
+            <w:r>
+              <w:rPr>
+                <w:rFonts w:ascii="Courier New" w:hAnsi="Courier New" w:cs="Courier New"/>
+                <w:b/>
+                <w:i w:val="0"/>
+                <w:sz w:val="18"/>
+              </w:rPr>
+              <w:t>[SCREENSHOT REQUIRED]</w:t>
+            </w:r>
+          </w:p>
+          <w:p>
+            <w:r>
+              <w:rPr>
+                <w:rFonts w:ascii="Courier New" w:hAnsi="Courier New" w:cs="Courier New"/>
+                <w:b w:val="0"/>
+                <w:i w:val="0"/>
+                <w:sz w:val="18"/>
+              </w:rPr>
+              <w:t>HOW: Set APP_BACKEND=microservices in lab1/academe/.env</w:t>
+            </w:r>
+          </w:p>
+          <w:p>
+            <w:r>
+              <w:rPr>
+                <w:rFonts w:ascii="Courier New" w:hAnsi="Courier New" w:cs="Courier New"/>
+                <w:b w:val="0"/>
+                <w:i w:val="0"/>
+                <w:sz w:val="18"/>
+              </w:rPr>
+              <w:t>Run: php artisan config:clear</w:t>
+            </w:r>
+          </w:p>
+          <w:p>
+            <w:r>
+              <w:rPr>
+                <w:rFonts w:ascii="Courier New" w:hAnsi="Courier New" w:cs="Courier New"/>
+                <w:b w:val="0"/>
+                <w:i w:val="0"/>
+                <w:sz w:val="18"/>
+              </w:rPr>
+              <w:t>Visit: localhost:8000/architecture</w:t>
+            </w:r>
+          </w:p>
+          <w:p>
+            <w:r>
+              <w:rPr>
+                <w:rFonts w:ascii="Courier New" w:hAnsi="Courier New" w:cs="Courier New"/>
+                <w:b w:val="0"/>
+                <w:i w:val="0"/>
+                <w:sz w:val="18"/>
+              </w:rPr>
+              <w:t>Screenshot: microservices diagram section</w:t>
+            </w:r>
+          </w:p>
+          <w:p>
+            <w:r>
+              <w:rPr>
+                <w:rFonts w:ascii="Cambria" w:hAnsi="Cambria" w:cs="Cambria"/>
+                <w:b w:val="0"/>
+                <w:i/>
+                <w:sz w:val="20"/>
+              </w:rPr>
+              <w:t>Caption: "Microservices Architecture — Three independent services each with own SQLite database, communicating via HTTP"</w:t>
+            </w:r>
+          </w:p>
+        </w:tc>
+      </w:tr>
+    </w:tbl>
+    <w:p/>
     <w:p>
       <w:pPr>
-        <w:spacing w:before="80" w:after="80"/>
+        <w:spacing w:before="240" w:after="120"/>
       </w:pPr>
       <w:r>
         <w:rPr>
-          <w:rFonts w:ascii="Consolas" w:hAnsi="Consolas"/>
-          <w:sz w:val="17"/>
+          <w:rFonts w:ascii="Cambria" w:hAnsi="Cambria" w:cs="Cambria"/>
+          <w:b/>
+          <w:i w:val="0"/>
+          <w:sz w:val="22"/>
         </w:rPr>
-        <w:t>REQUEST   → Browser (port 8000)</w:t>
-        <w:br/>
-        <w:t>ROUTE     → routes/api.php · routes/web.php</w:t>
-        <w:br/>
-        <w:t>VALIDATE  → app/Http/Requests/StoreStudentRequest · StoreEnrollmentRequest</w:t>
-        <w:br/>
-        <w:t>CONTROL   → app/Http/Controllers/StudentController · CourseController · EnrollmentController</w:t>
-        <w:br/>
-        <w:t>REPO      → Repositories/Interfaces/ → Repositories/ (Eloquent implementations)</w:t>
-        <w:br/>
-        <w:t>MODEL     → app/Models/Student · Course · Enrollment (Eloquent ORM)</w:t>
-        <w:br/>
-        <w:t>DATABASE  → SQLite (database.sqlite)</w:t>
-        <w:br/>
-        <w:br/>
-        <w:t>RESPONSE  → Controller → View (Blade) → HTTP Response</w:t>
+        <w:t>Section 3 — Full Page Comparison</w:t>
       </w:r>
     </w:p>
-    <w:p>
-      <w:pPr>
-        <w:pStyle w:val="ListBullet"/>
-      </w:pPr>
-      <w:r>
-        <w:t>All three domain objects (Student, Course, Enrollment) share a single SQLite database.</w:t>
-      </w:r>
-    </w:p>
-    <w:p>
-      <w:pPr>
-        <w:pStyle w:val="ListBullet"/>
-      </w:pPr>
-      <w:r>
-        <w:t>Repository interfaces are bound to Eloquent implementations in AppServiceProvider.</w:t>
-      </w:r>
-    </w:p>
-    <w:p>
-      <w:pPr>
-        <w:pStyle w:val="ListBullet"/>
-      </w:pPr>
-      <w:r>
-        <w:t>Controllers receive repository implementations via constructor injection — they never call Eloquent directly.</w:t>
-      </w:r>
-    </w:p>
-    <w:p>
-      <w:pPr>
-        <w:pStyle w:val="ListBullet"/>
-      </w:pPr>
-      <w:r>
-        <w:t>Form validation is handled before the controller executes via FormRequest classes, keeping controllers focused on orchestration.</w:t>
-      </w:r>
-    </w:p>
-    <w:p>
-      <w:pPr>
-        <w:pStyle w:val="ListBullet"/>
-      </w:pPr>
-      <w:r>
-        <w:t>Cascade deletes (e.g., deleting a student removes their enrollments) are handled in the repository layer.</w:t>
-      </w:r>
-    </w:p>
-    <w:p>
-      <w:pPr>
-        <w:pStyle w:val="Heading2"/>
-      </w:pPr>
-      <w:r>
-        <w:t>2. Microservices Architecture</w:t>
-      </w:r>
-    </w:p>
-    <w:p>
-      <w:r>
-        <w:rPr>
-          <w:b w:val="0"/>
-        </w:rPr>
-        <w:t>The system is split into three independent Laravel services, each owning its own SQLite database.</w:t>
-      </w:r>
-    </w:p>
-    <w:p>
-      <w:pPr>
-        <w:spacing w:before="80" w:after="80"/>
-      </w:pPr>
-      <w:r>
-        <w:rPr>
-          <w:rFonts w:ascii="Consolas" w:hAnsi="Consolas"/>
-          <w:sz w:val="17"/>
-        </w:rPr>
-        <w:t>Academe Laravel App :8000  (APP_BACKEND=microservices)</w:t>
-        <w:br/>
-        <w:t xml:space="preserve">    │          │          │</w:t>
-        <w:br/>
-        <w:t xml:space="preserve">    ▼          ▼          ▼</w:t>
-        <w:br/>
-        <w:t>STUDENT SVC  COURSE SVC  ENROLLMENT SVC</w:t>
-        <w:br/>
-        <w:t xml:space="preserve">  :8001        :8002       :8003</w:t>
-        <w:br/>
-        <w:t xml:space="preserve"> REST API     REST API    REST API</w:t>
-        <w:br/>
-        <w:t xml:space="preserve"> students.    courses.    enrollments.</w:t>
-        <w:br/>
-        <w:t xml:space="preserve">  sqlite       sqlite      sqlite</w:t>
-        <w:br/>
-        <w:br/>
-        <w:t>Inter-service HTTP:</w:t>
-        <w:br/>
-        <w:t xml:space="preserve">  Enrollment :8003 → GET /api/students/{id}  (:8001)</w:t>
-        <w:br/>
-        <w:t xml:space="preserve">  Enrollment :8003 → GET /api/courses/{id}   (:8002)</w:t>
-      </w:r>
-    </w:p>
-    <w:p>
-      <w:pPr>
-        <w:pStyle w:val="ListBullet"/>
-      </w:pPr>
-      <w:r>
-        <w:t>Each service owns its own SQLite database and only its domain data.</w:t>
-      </w:r>
-    </w:p>
-    <w:p>
-      <w:pPr>
-        <w:pStyle w:val="ListBullet"/>
-      </w:pPr>
-      <w:r>
-        <w:t>The enrollment service validates foreign keys via synchronous HTTP GET calls before writing.</w:t>
-      </w:r>
-    </w:p>
-    <w:p>
-      <w:pPr>
-        <w:pStyle w:val="ListBullet"/>
-      </w:pPr>
-      <w:r>
-        <w:t>No shared database, no message queue, no API gateway.</w:t>
-      </w:r>
-    </w:p>
-    <w:p>
-      <w:pPr>
-        <w:pStyle w:val="ListBullet"/>
-      </w:pPr>
-      <w:r>
-        <w:t>Http::timeout(5) is used for all cross-service calls. Failures produce 503 or 504.</w:t>
-      </w:r>
-    </w:p>
-    <w:p>
-      <w:pPr>
-        <w:pStyle w:val="ListBullet"/>
-      </w:pPr>
-      <w:r>
-        <w:t>JSON API format: {"data": {...}, "message": "..."} — consistent across all services.</w:t>
-      </w:r>
-    </w:p>
-    <w:p>
-      <w:pPr>
-        <w:pStyle w:val="Heading2"/>
-      </w:pPr>
-      <w:r>
-        <w:t>3. Backend Switch Mechanism</w:t>
-      </w:r>
-    </w:p>
-    <w:p>
-      <w:r>
-        <w:rPr>
-          <w:b w:val="0"/>
-        </w:rPr>
-        <w:t>The monolithic app can operate in two modes controlled by APP_BACKEND in .env:</w:t>
-      </w:r>
-    </w:p>
-    <w:p>
-      <w:pPr>
-        <w:spacing w:before="80" w:after="80"/>
-      </w:pPr>
-      <w:r>
-        <w:rPr>
-          <w:rFonts w:ascii="Consolas" w:hAnsi="Consolas"/>
-          <w:sz w:val="17"/>
-        </w:rPr>
-        <w:t>Controllers:</w:t>
-        <w:br/>
-        <w:t xml:space="preserve">  if (config('backend.mode') === 'microservices')</w:t>
-        <w:br/>
-        <w:t xml:space="preserve">      → use ServiceClient (HTTP calls to :8001/8002/8003)</w:t>
-        <w:br/>
-        <w:t xml:space="preserve">  else</w:t>
-        <w:br/>
-        <w:t xml:space="preserve">      → use Repository (direct Eloquent/SQLite)</w:t>
-      </w:r>
-    </w:p>
-    <w:p>
-      <w:r>
-        <w:rPr>
-          <w:b/>
-        </w:rPr>
-        <w:t>Service Clients (app/Services/):</w:t>
-      </w:r>
-    </w:p>
-    <w:p>
-      <w:pPr>
-        <w:pStyle w:val="ListBullet"/>
-      </w:pPr>
-      <w:r>
-        <w:t>StudentServiceClient — full CRUD via HTTP to :8001</w:t>
-      </w:r>
-    </w:p>
-    <w:p>
-      <w:pPr>
-        <w:pStyle w:val="ListBullet"/>
-      </w:pPr>
-      <w:r>
-        <w:t>CourseServiceClient — full CRUD via HTTP to :8002</w:t>
-      </w:r>
-    </w:p>
-    <w:p>
-      <w:pPr>
-        <w:pStyle w:val="ListBullet"/>
-      </w:pPr>
-      <w:r>
-        <w:t>EnrollmentServiceClient — CRUD + byStudent() via HTTP to :8003</w:t>
-      </w:r>
-    </w:p>
-    <w:p>
-      <w:r>
-        <w:rPr>
-          <w:b w:val="0"/>
-        </w:rPr>
-        <w:t>Each controller checks config('backend.mode') and branches at the top. Views receive the same data shape regardless of backend mode. To switch: set APP_BACKEND in .env, run php artisan config:clear, and refresh.</w:t>
-      </w:r>
-    </w:p>
-    <w:p>
-      <w:pPr>
-        <w:pStyle w:val="Heading2"/>
-      </w:pPr>
-      <w:r>
-        <w:t>4. Data Flow: Create Enrollment</w:t>
-      </w:r>
-    </w:p>
-    <w:p>
-      <w:r>
-        <w:rPr>
-          <w:b/>
-        </w:rPr>
-        <w:t>Monolithic mode:</w:t>
-      </w:r>
-    </w:p>
-    <w:p>
-      <w:pPr>
-        <w:spacing w:before="80" w:after="80"/>
-      </w:pPr>
-      <w:r>
-        <w:rPr>
-          <w:rFonts w:ascii="Consolas" w:hAnsi="Consolas"/>
-          <w:sz w:val="17"/>
-        </w:rPr>
-        <w:t>Browser POST /enrollments {student_id, course_id}</w:t>
-        <w:br/>
-        <w:t xml:space="preserve">  → EnrollmentController::store()</w:t>
-        <w:br/>
-        <w:t xml:space="preserve">    → StoreEnrollmentRequest validates (exists:students, exists:courses)</w:t>
-        <w:br/>
-        <w:t xml:space="preserve">    → EnrollmentRepository::create()</w:t>
-        <w:br/>
-        <w:t xml:space="preserve">      → Enrollment::create() [single SQLite DB]</w:t>
-        <w:br/>
-        <w:t xml:space="preserve">    → redirect with success</w:t>
-      </w:r>
-    </w:p>
-    <w:p>
-      <w:r>
-        <w:rPr>
-          <w:b/>
-        </w:rPr>
-        <w:t>Microservices mode:</w:t>
-      </w:r>
-    </w:p>
-    <w:p>
-      <w:pPr>
-        <w:spacing w:before="80" w:after="80"/>
-      </w:pPr>
-      <w:r>
-        <w:rPr>
-          <w:rFonts w:ascii="Consolas" w:hAnsi="Consolas"/>
-          <w:sz w:val="17"/>
-        </w:rPr>
-        <w:t>Browser POST /enrollments {student_id, course_id}</w:t>
-        <w:br/>
-        <w:t xml:space="preserve">  → EnrollmentController::store()</w:t>
-        <w:br/>
-        <w:t xml:space="preserve">    → EnrollmentServiceClient::create()</w:t>
-        <w:br/>
-        <w:t xml:space="preserve">      → POST http://localhost:8003/api/enrollments</w:t>
-        <w:br/>
-        <w:t xml:space="preserve">        → Validator::make (400 if invalid)</w:t>
-        <w:br/>
-        <w:t xml:space="preserve">        → GET http://localhost:8001/api/students/{id} (404/503/504)</w:t>
-        <w:br/>
-        <w:t xml:space="preserve">        → GET http://localhost:8002/api/courses/{id} (404/503/504)</w:t>
-        <w:br/>
-        <w:t xml:space="preserve">        → Check duplicate (409 if exists)</w:t>
-        <w:br/>
-        <w:t xml:space="preserve">        → Enrollment::create() → 201 Created</w:t>
-        <w:br/>
-        <w:t xml:space="preserve">    → redirect with success</w:t>
-      </w:r>
-    </w:p>
-    <w:p>
-      <w:r>
-        <w:rPr>
-          <w:b w:val="0"/>
-        </w:rPr>
-        <w:t>The two flows produce identical outcomes from the user's perspective — the differences are entirely in the infrastructure layer.</w:t>
-      </w:r>
-    </w:p>
+    <w:tbl>
+      <w:tblPr>
+        <w:tblW w:type="auto" w:w="0"/>
+        <w:jc w:val="center"/>
+        <w:tblLook w:firstColumn="1" w:firstRow="1" w:lastColumn="0" w:lastRow="0" w:noHBand="0" w:noVBand="1" w:val="04A0"/>
+      </w:tblPr>
+      <w:tblGrid>
+        <w:gridCol w:w="9360"/>
+      </w:tblGrid>
+      <w:tr>
+        <w:tc>
+          <w:tcPr>
+            <w:tcW w:type="dxa" w:w="9360"/>
+            <w:shd w:fill="F2F2F2"/>
+            <w:tcBorders>
+              <w:top w:val="single" w:sz="8" w:space="0" w:color="999999"/>
+              <w:left w:val="single" w:sz="8" w:space="0" w:color="999999"/>
+              <w:bottom w:val="single" w:sz="8" w:space="0" w:color="999999"/>
+              <w:right w:val="single" w:sz="8" w:space="0" w:color="999999"/>
+            </w:tcBorders>
+            <w:tcW w:w="9000" w:type="dxa"/>
+          </w:tcPr>
+          <w:p>
+            <w:r>
+              <w:rPr>
+                <w:rFonts w:ascii="Courier New" w:hAnsi="Courier New" w:cs="Courier New"/>
+                <w:b/>
+                <w:i w:val="0"/>
+                <w:sz w:val="18"/>
+              </w:rPr>
+              <w:t>[SCREENSHOT REQUIRED]</w:t>
+            </w:r>
+          </w:p>
+          <w:p>
+            <w:r>
+              <w:rPr>
+                <w:rFonts w:ascii="Courier New" w:hAnsi="Courier New" w:cs="Courier New"/>
+                <w:b w:val="0"/>
+                <w:i w:val="0"/>
+                <w:sz w:val="18"/>
+              </w:rPr>
+              <w:t>HOW: Visit localhost:8000/architecture</w:t>
+            </w:r>
+          </w:p>
+          <w:p>
+            <w:r>
+              <w:rPr>
+                <w:rFonts w:ascii="Courier New" w:hAnsi="Courier New" w:cs="Courier New"/>
+                <w:b w:val="0"/>
+                <w:i w:val="0"/>
+                <w:sz w:val="18"/>
+              </w:rPr>
+              <w:t>Screenshot the full page showing both diagrams</w:t>
+            </w:r>
+          </w:p>
+          <w:p>
+            <w:r>
+              <w:rPr>
+                <w:rFonts w:ascii="Courier New" w:hAnsi="Courier New" w:cs="Courier New"/>
+                <w:b w:val="0"/>
+                <w:i w:val="0"/>
+                <w:sz w:val="18"/>
+              </w:rPr>
+              <w:t>with active backend highlighted and inactive dimmed</w:t>
+            </w:r>
+          </w:p>
+          <w:p>
+            <w:r>
+              <w:rPr>
+                <w:rFonts w:ascii="Cambria" w:hAnsi="Cambria" w:cs="Cambria"/>
+                <w:b w:val="0"/>
+                <w:i/>
+                <w:sz w:val="20"/>
+              </w:rPr>
+              <w:t>Caption: "Architecture comparison page — active backend highlighted, inactive backend dimmed"</w:t>
+            </w:r>
+          </w:p>
+        </w:tc>
+      </w:tr>
+    </w:tbl>
+    <w:p/>
     <w:sectPr>
+      <w:headerReference w:type="default" r:id="rId9"/>
+      <w:footerReference w:type="default" r:id="rId10"/>
       <w:pgSz w:w="12240" w:h="15840"/>
-      <w:pgMar w:top="1440" w:right="1800" w:bottom="1440" w:left="1800" w:header="720" w:footer="720" w:gutter="0"/>
+      <w:pgMar w:top="1440" w:right="1440" w:bottom="1440" w:left="1440" w:header="720" w:footer="720" w:gutter="0"/>
       <w:cols w:space="720"/>
       <w:docGrid w:linePitch="360"/>
     </w:sectPr>
   </w:body>
 </w:document>
+</file>
+
+<file path=word/footer1.xml><?xml version="1.0" encoding="utf-8"?>
+<w:ftr xmlns:m="http://schemas.openxmlformats.org/officeDocument/2006/math" xmlns:mc="http://schemas.openxmlformats.org/markup-compatibility/2006" xmlns:mo="http://schemas.microsoft.com/office/mac/office/2008/main" xmlns:mv="urn:schemas-microsoft-com:mac:vml" xmlns:o="urn:schemas-microsoft-com:office:office" xmlns:r="http://schemas.openxmlformats.org/officeDocument/2006/relationships" xmlns:v="urn:schemas-microsoft-com:vml" xmlns:w10="urn:schemas-microsoft-com:office:word" xmlns:w14="http://schemas.microsoft.com/office/word/2010/wordml" xmlns:w="http://schemas.openxmlformats.org/wordprocessingml/2006/main" xmlns:wne="http://schemas.microsoft.com/office/word/2006/wordml" xmlns:wp14="http://schemas.microsoft.com/office/word/2010/wordprocessingDrawing" xmlns:wp="http://schemas.openxmlformats.org/drawingml/2006/wordprocessingDrawing" xmlns:wpc="http://schemas.microsoft.com/office/word/2010/wordprocessingCanvas" xmlns:wpg="http://schemas.microsoft.com/office/word/2010/wordprocessingGroup" xmlns:wpi="http://schemas.microsoft.com/office/word/2010/wordprocessingInk" xmlns:wps="http://schemas.microsoft.com/office/word/2010/wordprocessingShape" mc:Ignorable="w14 wp14">
+  <w:p>
+    <w:pPr>
+      <w:pStyle w:val="Footer"/>
+      <w:jc w:val="center"/>
+    </w:pPr>
+    <w:r>
+      <w:rPr>
+        <w:rFonts w:ascii="Cambria" w:hAnsi="Cambria" w:cs="Cambria"/>
+        <w:b w:val="0"/>
+        <w:i w:val="0"/>
+        <w:sz w:val="18"/>
+      </w:rPr>
+      <w:t xml:space="preserve">Page </w:t>
+    </w:r>
+    <w:r>
+      <w:fldChar w:fldCharType="begin"/>
+    </w:r>
+    <w:r>
+      <w:instrText xml:space="preserve"> PAGE </w:instrText>
+    </w:r>
+    <w:r>
+      <w:fldChar w:fldCharType="end"/>
+    </w:r>
+    <w:r>
+      <w:rPr>
+        <w:rFonts w:ascii="Cambria" w:hAnsi="Cambria" w:cs="Cambria"/>
+        <w:b w:val="0"/>
+        <w:i w:val="0"/>
+        <w:sz w:val="18"/>
+      </w:rPr>
+      <w:t xml:space="preserve"> of </w:t>
+    </w:r>
+    <w:r>
+      <w:fldChar w:fldCharType="begin"/>
+    </w:r>
+    <w:r>
+      <w:instrText xml:space="preserve"> NUMPAGES </w:instrText>
+    </w:r>
+    <w:r>
+      <w:fldChar w:fldCharType="end"/>
+    </w:r>
+  </w:p>
+</w:ftr>
+</file>
+
+<file path=word/header1.xml><?xml version="1.0" encoding="utf-8"?>
+<w:hdr xmlns:m="http://schemas.openxmlformats.org/officeDocument/2006/math" xmlns:mc="http://schemas.openxmlformats.org/markup-compatibility/2006" xmlns:mo="http://schemas.microsoft.com/office/mac/office/2008/main" xmlns:mv="urn:schemas-microsoft-com:mac:vml" xmlns:o="urn:schemas-microsoft-com:office:office" xmlns:r="http://schemas.openxmlformats.org/officeDocument/2006/relationships" xmlns:v="urn:schemas-microsoft-com:vml" xmlns:w10="urn:schemas-microsoft-com:office:word" xmlns:w14="http://schemas.microsoft.com/office/word/2010/wordml" xmlns:w="http://schemas.openxmlformats.org/wordprocessingml/2006/main" xmlns:wne="http://schemas.microsoft.com/office/word/2006/wordml" xmlns:wp14="http://schemas.microsoft.com/office/word/2010/wordprocessingDrawing" xmlns:wp="http://schemas.openxmlformats.org/drawingml/2006/wordprocessingDrawing" xmlns:wpc="http://schemas.microsoft.com/office/word/2010/wordprocessingCanvas" xmlns:wpg="http://schemas.microsoft.com/office/word/2010/wordprocessingGroup" xmlns:wpi="http://schemas.microsoft.com/office/word/2010/wordprocessingInk" xmlns:wps="http://schemas.microsoft.com/office/word/2010/wordprocessingShape" mc:Ignorable="w14 wp14">
+  <w:p>
+    <w:pPr>
+      <w:pStyle w:val="Header"/>
+      <w:jc w:val="center"/>
+    </w:pPr>
+    <w:r>
+      <w:rPr>
+        <w:rFonts w:ascii="Cambria" w:hAnsi="Cambria" w:cs="Cambria"/>
+        <w:b w:val="0"/>
+        <w:i/>
+        <w:sz w:val="18"/>
+      </w:rPr>
+      <w:t>ITSAR2 313 – SYSTEM INTEGRATION AND ARCHITECTURE 2</w:t>
+    </w:r>
+  </w:p>
+</w:hdr>
 </file>
 
 <file path=word/numbering.xml><?xml version="1.0" encoding="utf-8"?>
@@ -741,10 +852,12 @@
     <w:qFormat/>
     <w:rsid w:val="00FC693F"/>
     <w:rPr>
-      <w:rFonts w:ascii="Calibri" w:hAnsi="Calibri"/>
-      <w:color w:val="666666"/>
-      <w:sz w:val="18"/>
+      <w:rFonts w:ascii="Cambria" w:hAnsi="Cambria" w:cs="Cambria"/>
+      <w:sz w:val="20"/>
     </w:rPr>
+    <w:pPr>
+      <w:spacing w:line="276" w:lineRule="auto"/>
+    </w:pPr>
   </w:style>
   <w:style w:type="paragraph" w:styleId="Header">
     <w:name w:val="header"/>

</xml_diff>